<commit_message>
feat(UAT): update test cases and add verification scripts for UAT-007 and UAT-008
</commit_message>
<xml_diff>
--- a/docs/GOI_UAT_KHACH_HANG/05_KICH_BAN_KIEM_THU_13_TAI_KHOAN.docx
+++ b/docs/GOI_UAT_KHACH_HANG/05_KICH_BAN_KIEM_THU_13_TAI_KHOAN.docx
@@ -4662,6 +4662,15 @@
               <w:spacing w:after="0" w:before="0" w:line="245"/>
               <w:jc w:val="left"/>
             </w:pPr>
+            <w:r>
+              <w:rPr>
+                <w:rFonts w:ascii="Arial" w:cs="Arial" w:eastAsia="Arial" w:hAnsi="Arial"/>
+                <w:color w:val="28332E"/>
+                <w:sz w:val="16"/>
+                <w:szCs w:val="16"/>
+              </w:rPr>
+              <w:t xml:space="preserve">☑ PASS kỹ thuật (smoke)</w:t>
+            </w:r>
           </w:p>
         </w:tc>
       </w:tr>
@@ -4922,6 +4931,15 @@
               <w:spacing w:after="0" w:before="0" w:line="245"/>
               <w:jc w:val="left"/>
             </w:pPr>
+            <w:r>
+              <w:rPr>
+                <w:rFonts w:ascii="Arial" w:cs="Arial" w:eastAsia="Arial" w:hAnsi="Arial"/>
+                <w:color w:val="28332E"/>
+                <w:sz w:val="16"/>
+                <w:szCs w:val="16"/>
+              </w:rPr>
+              <w:t xml:space="preserve">☑ PASS kỹ thuật (smoke)</w:t>
+            </w:r>
           </w:p>
         </w:tc>
       </w:tr>
@@ -5182,6 +5200,15 @@
               <w:spacing w:after="0" w:before="0" w:line="245"/>
               <w:jc w:val="left"/>
             </w:pPr>
+            <w:r>
+              <w:rPr>
+                <w:rFonts w:ascii="Arial" w:cs="Arial" w:eastAsia="Arial" w:hAnsi="Arial"/>
+                <w:color w:val="28332E"/>
+                <w:sz w:val="16"/>
+                <w:szCs w:val="16"/>
+              </w:rPr>
+              <w:t xml:space="preserve">☑ PASS kỹ thuật (smoke)</w:t>
+            </w:r>
           </w:p>
         </w:tc>
       </w:tr>
@@ -5889,6 +5916,1319 @@
               <w:spacing w:after="0" w:before="0" w:line="245"/>
               <w:jc w:val="left"/>
             </w:pPr>
+          </w:p>
+        </w:tc>
+      </w:tr>
+    </w:tbl>
+    <w:p>
+      <w:pPr>
+        <w:spacing w:after="140" w:before="0" w:line="280"/>
+      </w:pPr>
+    </w:p>
+    <w:p>
+      <w:pPr>
+        <w:keepNext/>
+        <w:spacing w:after="90" w:before="200" w:line="280"/>
+      </w:pPr>
+      <w:r>
+        <w:rPr>
+          <w:rFonts w:ascii="Arial" w:cs="Arial" w:eastAsia="Arial" w:hAnsi="Arial"/>
+          <w:b/>
+          <w:bCs/>
+          <w:color w:val="2457A6"/>
+          <w:sz w:val="24"/>
+          <w:szCs w:val="24"/>
+        </w:rPr>
+        <w:t xml:space="preserve">Kết quả smoke kỹ thuật đã có</w:t>
+      </w:r>
+    </w:p>
+    <w:p>
+      <w:pPr>
+        <w:spacing w:after="120" w:before="0" w:line="280"/>
+      </w:pPr>
+      <w:r>
+        <w:rPr>
+          <w:rFonts w:ascii="Arial" w:cs="Arial" w:eastAsia="Arial" w:hAnsi="Arial"/>
+          <w:color w:val="66736D"/>
+          <w:sz w:val="18"/>
+          <w:szCs w:val="18"/>
+        </w:rPr>
+        <w:t xml:space="preserve">Đã chạy trên hồ sơ Sale và Quản lý; mỗi hồ sơ đạt 8/8, không có lỗi HTTP, lỗi hệ thống hoặc lỗi phân tuyến. Đây là bằng chứng kỹ thuật, chưa thay cho kết quả khách hàng tự nghiệm thu.</w:t>
+      </w:r>
+    </w:p>
+    <w:tbl>
+      <w:tblPr>
+        <w:tblW w:type="dxa" w:w="9638"/>
+        <w:tblBorders>
+          <w:top w:val="single" w:color="auto" w:sz="4"/>
+          <w:left w:val="single" w:color="auto" w:sz="4"/>
+          <w:bottom w:val="single" w:color="auto" w:sz="4"/>
+          <w:right w:val="single" w:color="auto" w:sz="4"/>
+          <w:insideH w:val="single" w:color="auto" w:sz="4"/>
+          <w:insideV w:val="single" w:color="auto" w:sz="4"/>
+        </w:tblBorders>
+        <w:tblLayout w:type="fixed"/>
+      </w:tblPr>
+      <w:tblGrid>
+        <w:gridCol w:w="1157"/>
+        <w:gridCol w:w="4048"/>
+        <w:gridCol w:w="2217"/>
+        <w:gridCol w:w="2216"/>
+      </w:tblGrid>
+      <w:tr>
+        <w:trPr>
+          <w:tblHeader/>
+        </w:trPr>
+        <w:tc>
+          <w:tcPr>
+            <w:tcW w:type="dxa" w:w="1157"/>
+            <w:tcBorders>
+              <w:top w:val="single" w:color="CBD5CF" w:sz="2"/>
+              <w:left w:val="single" w:color="CBD5CF" w:sz="2"/>
+              <w:bottom w:val="single" w:color="CBD5CF" w:sz="2"/>
+              <w:right w:val="single" w:color="CBD5CF" w:sz="2"/>
+            </w:tcBorders>
+            <w:shd w:fill="E8EEF5" w:val="clear"/>
+            <w:tcMar>
+              <w:top w:type="dxa" w:w="90"/>
+              <w:left w:type="dxa" w:w="110"/>
+              <w:bottom w:type="dxa" w:w="90"/>
+              <w:right w:type="dxa" w:w="110"/>
+            </w:tcMar>
+            <w:vAlign w:val="center"/>
+          </w:tcPr>
+          <w:p>
+            <w:pPr>
+              <w:spacing w:after="0" w:before="0" w:line="240"/>
+            </w:pPr>
+            <w:r>
+              <w:rPr>
+                <w:rFonts w:ascii="Arial" w:cs="Arial" w:eastAsia="Arial" w:hAnsi="Arial"/>
+                <w:b/>
+                <w:bCs/>
+                <w:color w:val="17221D"/>
+                <w:sz w:val="16"/>
+                <w:szCs w:val="16"/>
+              </w:rPr>
+              <w:t xml:space="preserve">Ca smoke</w:t>
+            </w:r>
+          </w:p>
+        </w:tc>
+        <w:tc>
+          <w:tcPr>
+            <w:tcW w:type="dxa" w:w="4048"/>
+            <w:tcBorders>
+              <w:top w:val="single" w:color="CBD5CF" w:sz="2"/>
+              <w:left w:val="single" w:color="CBD5CF" w:sz="2"/>
+              <w:bottom w:val="single" w:color="CBD5CF" w:sz="2"/>
+              <w:right w:val="single" w:color="CBD5CF" w:sz="2"/>
+            </w:tcBorders>
+            <w:shd w:fill="E8EEF5" w:val="clear"/>
+            <w:tcMar>
+              <w:top w:type="dxa" w:w="90"/>
+              <w:left w:type="dxa" w:w="110"/>
+              <w:bottom w:type="dxa" w:w="90"/>
+              <w:right w:type="dxa" w:w="110"/>
+            </w:tcMar>
+            <w:vAlign w:val="center"/>
+          </w:tcPr>
+          <w:p>
+            <w:pPr>
+              <w:spacing w:after="0" w:before="0" w:line="240"/>
+            </w:pPr>
+            <w:r>
+              <w:rPr>
+                <w:rFonts w:ascii="Arial" w:cs="Arial" w:eastAsia="Arial" w:hAnsi="Arial"/>
+                <w:b/>
+                <w:bCs/>
+                <w:color w:val="17221D"/>
+                <w:sz w:val="16"/>
+                <w:szCs w:val="16"/>
+              </w:rPr>
+              <w:t xml:space="preserve">Thao tác</w:t>
+            </w:r>
+          </w:p>
+        </w:tc>
+        <w:tc>
+          <w:tcPr>
+            <w:tcW w:type="dxa" w:w="2217"/>
+            <w:tcBorders>
+              <w:top w:val="single" w:color="CBD5CF" w:sz="2"/>
+              <w:left w:val="single" w:color="CBD5CF" w:sz="2"/>
+              <w:bottom w:val="single" w:color="CBD5CF" w:sz="2"/>
+              <w:right w:val="single" w:color="CBD5CF" w:sz="2"/>
+            </w:tcBorders>
+            <w:shd w:fill="E8EEF5" w:val="clear"/>
+            <w:tcMar>
+              <w:top w:type="dxa" w:w="90"/>
+              <w:left w:type="dxa" w:w="110"/>
+              <w:bottom w:type="dxa" w:w="90"/>
+              <w:right w:type="dxa" w:w="110"/>
+            </w:tcMar>
+            <w:vAlign w:val="center"/>
+          </w:tcPr>
+          <w:p>
+            <w:pPr>
+              <w:spacing w:after="0" w:before="0" w:line="240"/>
+            </w:pPr>
+            <w:r>
+              <w:rPr>
+                <w:rFonts w:ascii="Arial" w:cs="Arial" w:eastAsia="Arial" w:hAnsi="Arial"/>
+                <w:b/>
+                <w:bCs/>
+                <w:color w:val="17221D"/>
+                <w:sz w:val="16"/>
+                <w:szCs w:val="16"/>
+              </w:rPr>
+              <w:t xml:space="preserve">Sale</w:t>
+            </w:r>
+          </w:p>
+        </w:tc>
+        <w:tc>
+          <w:tcPr>
+            <w:tcW w:type="dxa" w:w="2216"/>
+            <w:tcBorders>
+              <w:top w:val="single" w:color="CBD5CF" w:sz="2"/>
+              <w:left w:val="single" w:color="CBD5CF" w:sz="2"/>
+              <w:bottom w:val="single" w:color="CBD5CF" w:sz="2"/>
+              <w:right w:val="single" w:color="CBD5CF" w:sz="2"/>
+            </w:tcBorders>
+            <w:shd w:fill="E8EEF5" w:val="clear"/>
+            <w:tcMar>
+              <w:top w:type="dxa" w:w="90"/>
+              <w:left w:type="dxa" w:w="110"/>
+              <w:bottom w:type="dxa" w:w="90"/>
+              <w:right w:type="dxa" w:w="110"/>
+            </w:tcMar>
+            <w:vAlign w:val="center"/>
+          </w:tcPr>
+          <w:p>
+            <w:pPr>
+              <w:spacing w:after="0" w:before="0" w:line="240"/>
+            </w:pPr>
+            <w:r>
+              <w:rPr>
+                <w:rFonts w:ascii="Arial" w:cs="Arial" w:eastAsia="Arial" w:hAnsi="Arial"/>
+                <w:b/>
+                <w:bCs/>
+                <w:color w:val="17221D"/>
+                <w:sz w:val="16"/>
+                <w:szCs w:val="16"/>
+              </w:rPr>
+              <w:t xml:space="preserve">Quản lý</w:t>
+            </w:r>
+          </w:p>
+        </w:tc>
+      </w:tr>
+      <w:tr>
+        <w:trPr>
+          <w:cantSplit/>
+        </w:trPr>
+        <w:tc>
+          <w:tcPr>
+            <w:tcW w:type="dxa" w:w="1157"/>
+            <w:tcBorders>
+              <w:top w:val="single" w:color="CBD5CF" w:sz="2"/>
+              <w:left w:val="single" w:color="CBD5CF" w:sz="2"/>
+              <w:bottom w:val="single" w:color="CBD5CF" w:sz="2"/>
+              <w:right w:val="single" w:color="CBD5CF" w:sz="2"/>
+            </w:tcBorders>
+            <w:tcMar>
+              <w:top w:type="dxa" w:w="85"/>
+              <w:left w:type="dxa" w:w="110"/>
+              <w:bottom w:type="dxa" w:w="85"/>
+              <w:right w:type="dxa" w:w="110"/>
+            </w:tcMar>
+            <w:vAlign w:val="center"/>
+          </w:tcPr>
+          <w:p>
+            <w:pPr>
+              <w:spacing w:after="0" w:before="0" w:line="235"/>
+              <w:jc w:val="center"/>
+            </w:pPr>
+            <w:r>
+              <w:rPr>
+                <w:rFonts w:ascii="Arial" w:cs="Arial" w:eastAsia="Arial" w:hAnsi="Arial"/>
+                <w:color w:val="28332E"/>
+                <w:sz w:val="16"/>
+                <w:szCs w:val="16"/>
+              </w:rPr>
+              <w:t xml:space="preserve">SM-01</w:t>
+            </w:r>
+          </w:p>
+        </w:tc>
+        <w:tc>
+          <w:tcPr>
+            <w:tcW w:type="dxa" w:w="4048"/>
+            <w:tcBorders>
+              <w:top w:val="single" w:color="CBD5CF" w:sz="2"/>
+              <w:left w:val="single" w:color="CBD5CF" w:sz="2"/>
+              <w:bottom w:val="single" w:color="CBD5CF" w:sz="2"/>
+              <w:right w:val="single" w:color="CBD5CF" w:sz="2"/>
+            </w:tcBorders>
+            <w:tcMar>
+              <w:top w:type="dxa" w:w="85"/>
+              <w:left w:type="dxa" w:w="110"/>
+              <w:bottom w:type="dxa" w:w="85"/>
+              <w:right w:type="dxa" w:w="110"/>
+            </w:tcMar>
+            <w:vAlign w:val="center"/>
+          </w:tcPr>
+          <w:p>
+            <w:pPr>
+              <w:spacing w:after="0" w:before="0" w:line="235"/>
+              <w:jc w:val="left"/>
+            </w:pPr>
+            <w:r>
+              <w:rPr>
+                <w:rFonts w:ascii="Arial" w:cs="Arial" w:eastAsia="Arial" w:hAnsi="Arial"/>
+                <w:color w:val="28332E"/>
+                <w:sz w:val="16"/>
+                <w:szCs w:val="16"/>
+              </w:rPr>
+              <w:t xml:space="preserve">Xin chào</w:t>
+            </w:r>
+          </w:p>
+        </w:tc>
+        <w:tc>
+          <w:tcPr>
+            <w:tcW w:type="dxa" w:w="2217"/>
+            <w:tcBorders>
+              <w:top w:val="single" w:color="CBD5CF" w:sz="2"/>
+              <w:left w:val="single" w:color="CBD5CF" w:sz="2"/>
+              <w:bottom w:val="single" w:color="CBD5CF" w:sz="2"/>
+              <w:right w:val="single" w:color="CBD5CF" w:sz="2"/>
+            </w:tcBorders>
+            <w:tcMar>
+              <w:top w:type="dxa" w:w="85"/>
+              <w:left w:type="dxa" w:w="110"/>
+              <w:bottom w:type="dxa" w:w="85"/>
+              <w:right w:type="dxa" w:w="110"/>
+            </w:tcMar>
+            <w:vAlign w:val="center"/>
+          </w:tcPr>
+          <w:p>
+            <w:pPr>
+              <w:spacing w:after="0" w:before="0" w:line="235"/>
+              <w:jc w:val="left"/>
+            </w:pPr>
+            <w:r>
+              <w:rPr>
+                <w:rFonts w:ascii="Arial" w:cs="Arial" w:eastAsia="Arial" w:hAnsi="Arial"/>
+                <w:color w:val="28332E"/>
+                <w:sz w:val="16"/>
+                <w:szCs w:val="16"/>
+              </w:rPr>
+              <w:t xml:space="preserve">☑ PASS kỹ thuật (smoke)</w:t>
+            </w:r>
+          </w:p>
+        </w:tc>
+        <w:tc>
+          <w:tcPr>
+            <w:tcW w:type="dxa" w:w="2216"/>
+            <w:tcBorders>
+              <w:top w:val="single" w:color="CBD5CF" w:sz="2"/>
+              <w:left w:val="single" w:color="CBD5CF" w:sz="2"/>
+              <w:bottom w:val="single" w:color="CBD5CF" w:sz="2"/>
+              <w:right w:val="single" w:color="CBD5CF" w:sz="2"/>
+            </w:tcBorders>
+            <w:tcMar>
+              <w:top w:type="dxa" w:w="85"/>
+              <w:left w:type="dxa" w:w="110"/>
+              <w:bottom w:type="dxa" w:w="85"/>
+              <w:right w:type="dxa" w:w="110"/>
+            </w:tcMar>
+            <w:vAlign w:val="center"/>
+          </w:tcPr>
+          <w:p>
+            <w:pPr>
+              <w:spacing w:after="0" w:before="0" w:line="235"/>
+              <w:jc w:val="left"/>
+            </w:pPr>
+            <w:r>
+              <w:rPr>
+                <w:rFonts w:ascii="Arial" w:cs="Arial" w:eastAsia="Arial" w:hAnsi="Arial"/>
+                <w:color w:val="28332E"/>
+                <w:sz w:val="16"/>
+                <w:szCs w:val="16"/>
+              </w:rPr>
+              <w:t xml:space="preserve">☑ PASS kỹ thuật (smoke)</w:t>
+            </w:r>
+          </w:p>
+        </w:tc>
+      </w:tr>
+      <w:tr>
+        <w:trPr>
+          <w:cantSplit/>
+        </w:trPr>
+        <w:tc>
+          <w:tcPr>
+            <w:tcW w:type="dxa" w:w="1157"/>
+            <w:tcBorders>
+              <w:top w:val="single" w:color="CBD5CF" w:sz="2"/>
+              <w:left w:val="single" w:color="CBD5CF" w:sz="2"/>
+              <w:bottom w:val="single" w:color="CBD5CF" w:sz="2"/>
+              <w:right w:val="single" w:color="CBD5CF" w:sz="2"/>
+            </w:tcBorders>
+            <w:shd w:fill="F4F7F5" w:val="clear"/>
+            <w:tcMar>
+              <w:top w:type="dxa" w:w="85"/>
+              <w:left w:type="dxa" w:w="110"/>
+              <w:bottom w:type="dxa" w:w="85"/>
+              <w:right w:type="dxa" w:w="110"/>
+            </w:tcMar>
+            <w:vAlign w:val="center"/>
+          </w:tcPr>
+          <w:p>
+            <w:pPr>
+              <w:spacing w:after="0" w:before="0" w:line="235"/>
+              <w:jc w:val="center"/>
+            </w:pPr>
+            <w:r>
+              <w:rPr>
+                <w:rFonts w:ascii="Arial" w:cs="Arial" w:eastAsia="Arial" w:hAnsi="Arial"/>
+                <w:color w:val="28332E"/>
+                <w:sz w:val="16"/>
+                <w:szCs w:val="16"/>
+              </w:rPr>
+              <w:t xml:space="preserve">SM-02</w:t>
+            </w:r>
+          </w:p>
+        </w:tc>
+        <w:tc>
+          <w:tcPr>
+            <w:tcW w:type="dxa" w:w="4048"/>
+            <w:tcBorders>
+              <w:top w:val="single" w:color="CBD5CF" w:sz="2"/>
+              <w:left w:val="single" w:color="CBD5CF" w:sz="2"/>
+              <w:bottom w:val="single" w:color="CBD5CF" w:sz="2"/>
+              <w:right w:val="single" w:color="CBD5CF" w:sz="2"/>
+            </w:tcBorders>
+            <w:shd w:fill="F4F7F5" w:val="clear"/>
+            <w:tcMar>
+              <w:top w:type="dxa" w:w="85"/>
+              <w:left w:type="dxa" w:w="110"/>
+              <w:bottom w:type="dxa" w:w="85"/>
+              <w:right w:type="dxa" w:w="110"/>
+            </w:tcMar>
+            <w:vAlign w:val="center"/>
+          </w:tcPr>
+          <w:p>
+            <w:pPr>
+              <w:spacing w:after="0" w:before="0" w:line="235"/>
+              <w:jc w:val="left"/>
+            </w:pPr>
+            <w:r>
+              <w:rPr>
+                <w:rFonts w:ascii="Arial" w:cs="Arial" w:eastAsia="Arial" w:hAnsi="Arial"/>
+                <w:color w:val="28332E"/>
+                <w:sz w:val="16"/>
+                <w:szCs w:val="16"/>
+              </w:rPr>
+              <w:t xml:space="preserve">Tôi là ai?</w:t>
+            </w:r>
+          </w:p>
+        </w:tc>
+        <w:tc>
+          <w:tcPr>
+            <w:tcW w:type="dxa" w:w="2217"/>
+            <w:tcBorders>
+              <w:top w:val="single" w:color="CBD5CF" w:sz="2"/>
+              <w:left w:val="single" w:color="CBD5CF" w:sz="2"/>
+              <w:bottom w:val="single" w:color="CBD5CF" w:sz="2"/>
+              <w:right w:val="single" w:color="CBD5CF" w:sz="2"/>
+            </w:tcBorders>
+            <w:shd w:fill="F4F7F5" w:val="clear"/>
+            <w:tcMar>
+              <w:top w:type="dxa" w:w="85"/>
+              <w:left w:type="dxa" w:w="110"/>
+              <w:bottom w:type="dxa" w:w="85"/>
+              <w:right w:type="dxa" w:w="110"/>
+            </w:tcMar>
+            <w:vAlign w:val="center"/>
+          </w:tcPr>
+          <w:p>
+            <w:pPr>
+              <w:spacing w:after="0" w:before="0" w:line="235"/>
+              <w:jc w:val="left"/>
+            </w:pPr>
+            <w:r>
+              <w:rPr>
+                <w:rFonts w:ascii="Arial" w:cs="Arial" w:eastAsia="Arial" w:hAnsi="Arial"/>
+                <w:color w:val="28332E"/>
+                <w:sz w:val="16"/>
+                <w:szCs w:val="16"/>
+              </w:rPr>
+              <w:t xml:space="preserve">☑ PASS kỹ thuật (smoke)</w:t>
+            </w:r>
+          </w:p>
+        </w:tc>
+        <w:tc>
+          <w:tcPr>
+            <w:tcW w:type="dxa" w:w="2216"/>
+            <w:tcBorders>
+              <w:top w:val="single" w:color="CBD5CF" w:sz="2"/>
+              <w:left w:val="single" w:color="CBD5CF" w:sz="2"/>
+              <w:bottom w:val="single" w:color="CBD5CF" w:sz="2"/>
+              <w:right w:val="single" w:color="CBD5CF" w:sz="2"/>
+            </w:tcBorders>
+            <w:shd w:fill="F4F7F5" w:val="clear"/>
+            <w:tcMar>
+              <w:top w:type="dxa" w:w="85"/>
+              <w:left w:type="dxa" w:w="110"/>
+              <w:bottom w:type="dxa" w:w="85"/>
+              <w:right w:type="dxa" w:w="110"/>
+            </w:tcMar>
+            <w:vAlign w:val="center"/>
+          </w:tcPr>
+          <w:p>
+            <w:pPr>
+              <w:spacing w:after="0" w:before="0" w:line="235"/>
+              <w:jc w:val="left"/>
+            </w:pPr>
+            <w:r>
+              <w:rPr>
+                <w:rFonts w:ascii="Arial" w:cs="Arial" w:eastAsia="Arial" w:hAnsi="Arial"/>
+                <w:color w:val="28332E"/>
+                <w:sz w:val="16"/>
+                <w:szCs w:val="16"/>
+              </w:rPr>
+              <w:t xml:space="preserve">☑ PASS kỹ thuật (smoke)</w:t>
+            </w:r>
+          </w:p>
+        </w:tc>
+      </w:tr>
+      <w:tr>
+        <w:trPr>
+          <w:cantSplit/>
+        </w:trPr>
+        <w:tc>
+          <w:tcPr>
+            <w:tcW w:type="dxa" w:w="1157"/>
+            <w:tcBorders>
+              <w:top w:val="single" w:color="CBD5CF" w:sz="2"/>
+              <w:left w:val="single" w:color="CBD5CF" w:sz="2"/>
+              <w:bottom w:val="single" w:color="CBD5CF" w:sz="2"/>
+              <w:right w:val="single" w:color="CBD5CF" w:sz="2"/>
+            </w:tcBorders>
+            <w:tcMar>
+              <w:top w:type="dxa" w:w="85"/>
+              <w:left w:type="dxa" w:w="110"/>
+              <w:bottom w:type="dxa" w:w="85"/>
+              <w:right w:type="dxa" w:w="110"/>
+            </w:tcMar>
+            <w:vAlign w:val="center"/>
+          </w:tcPr>
+          <w:p>
+            <w:pPr>
+              <w:spacing w:after="0" w:before="0" w:line="235"/>
+              <w:jc w:val="center"/>
+            </w:pPr>
+            <w:r>
+              <w:rPr>
+                <w:rFonts w:ascii="Arial" w:cs="Arial" w:eastAsia="Arial" w:hAnsi="Arial"/>
+                <w:color w:val="28332E"/>
+                <w:sz w:val="16"/>
+                <w:szCs w:val="16"/>
+              </w:rPr>
+              <w:t xml:space="preserve">SM-03</w:t>
+            </w:r>
+          </w:p>
+        </w:tc>
+        <w:tc>
+          <w:tcPr>
+            <w:tcW w:type="dxa" w:w="4048"/>
+            <w:tcBorders>
+              <w:top w:val="single" w:color="CBD5CF" w:sz="2"/>
+              <w:left w:val="single" w:color="CBD5CF" w:sz="2"/>
+              <w:bottom w:val="single" w:color="CBD5CF" w:sz="2"/>
+              <w:right w:val="single" w:color="CBD5CF" w:sz="2"/>
+            </w:tcBorders>
+            <w:tcMar>
+              <w:top w:type="dxa" w:w="85"/>
+              <w:left w:type="dxa" w:w="110"/>
+              <w:bottom w:type="dxa" w:w="85"/>
+              <w:right w:type="dxa" w:w="110"/>
+            </w:tcMar>
+            <w:vAlign w:val="center"/>
+          </w:tcPr>
+          <w:p>
+            <w:pPr>
+              <w:spacing w:after="0" w:before="0" w:line="235"/>
+              <w:jc w:val="left"/>
+            </w:pPr>
+            <w:r>
+              <w:rPr>
+                <w:rFonts w:ascii="Arial" w:cs="Arial" w:eastAsia="Arial" w:hAnsi="Arial"/>
+                <w:color w:val="28332E"/>
+                <w:sz w:val="16"/>
+                <w:szCs w:val="16"/>
+              </w:rPr>
+              <w:t xml:space="preserve">Doanh số hôm nay</w:t>
+            </w:r>
+          </w:p>
+        </w:tc>
+        <w:tc>
+          <w:tcPr>
+            <w:tcW w:type="dxa" w:w="2217"/>
+            <w:tcBorders>
+              <w:top w:val="single" w:color="CBD5CF" w:sz="2"/>
+              <w:left w:val="single" w:color="CBD5CF" w:sz="2"/>
+              <w:bottom w:val="single" w:color="CBD5CF" w:sz="2"/>
+              <w:right w:val="single" w:color="CBD5CF" w:sz="2"/>
+            </w:tcBorders>
+            <w:tcMar>
+              <w:top w:type="dxa" w:w="85"/>
+              <w:left w:type="dxa" w:w="110"/>
+              <w:bottom w:type="dxa" w:w="85"/>
+              <w:right w:type="dxa" w:w="110"/>
+            </w:tcMar>
+            <w:vAlign w:val="center"/>
+          </w:tcPr>
+          <w:p>
+            <w:pPr>
+              <w:spacing w:after="0" w:before="0" w:line="235"/>
+              <w:jc w:val="left"/>
+            </w:pPr>
+            <w:r>
+              <w:rPr>
+                <w:rFonts w:ascii="Arial" w:cs="Arial" w:eastAsia="Arial" w:hAnsi="Arial"/>
+                <w:color w:val="28332E"/>
+                <w:sz w:val="16"/>
+                <w:szCs w:val="16"/>
+              </w:rPr>
+              <w:t xml:space="preserve">☑ PASS kỹ thuật (smoke)</w:t>
+            </w:r>
+          </w:p>
+        </w:tc>
+        <w:tc>
+          <w:tcPr>
+            <w:tcW w:type="dxa" w:w="2216"/>
+            <w:tcBorders>
+              <w:top w:val="single" w:color="CBD5CF" w:sz="2"/>
+              <w:left w:val="single" w:color="CBD5CF" w:sz="2"/>
+              <w:bottom w:val="single" w:color="CBD5CF" w:sz="2"/>
+              <w:right w:val="single" w:color="CBD5CF" w:sz="2"/>
+            </w:tcBorders>
+            <w:tcMar>
+              <w:top w:type="dxa" w:w="85"/>
+              <w:left w:type="dxa" w:w="110"/>
+              <w:bottom w:type="dxa" w:w="85"/>
+              <w:right w:type="dxa" w:w="110"/>
+            </w:tcMar>
+            <w:vAlign w:val="center"/>
+          </w:tcPr>
+          <w:p>
+            <w:pPr>
+              <w:spacing w:after="0" w:before="0" w:line="235"/>
+              <w:jc w:val="left"/>
+            </w:pPr>
+            <w:r>
+              <w:rPr>
+                <w:rFonts w:ascii="Arial" w:cs="Arial" w:eastAsia="Arial" w:hAnsi="Arial"/>
+                <w:color w:val="28332E"/>
+                <w:sz w:val="16"/>
+                <w:szCs w:val="16"/>
+              </w:rPr>
+              <w:t xml:space="preserve">☑ PASS kỹ thuật (smoke)</w:t>
+            </w:r>
+          </w:p>
+        </w:tc>
+      </w:tr>
+      <w:tr>
+        <w:trPr>
+          <w:cantSplit/>
+        </w:trPr>
+        <w:tc>
+          <w:tcPr>
+            <w:tcW w:type="dxa" w:w="1157"/>
+            <w:tcBorders>
+              <w:top w:val="single" w:color="CBD5CF" w:sz="2"/>
+              <w:left w:val="single" w:color="CBD5CF" w:sz="2"/>
+              <w:bottom w:val="single" w:color="CBD5CF" w:sz="2"/>
+              <w:right w:val="single" w:color="CBD5CF" w:sz="2"/>
+            </w:tcBorders>
+            <w:shd w:fill="F4F7F5" w:val="clear"/>
+            <w:tcMar>
+              <w:top w:type="dxa" w:w="85"/>
+              <w:left w:type="dxa" w:w="110"/>
+              <w:bottom w:type="dxa" w:w="85"/>
+              <w:right w:type="dxa" w:w="110"/>
+            </w:tcMar>
+            <w:vAlign w:val="center"/>
+          </w:tcPr>
+          <w:p>
+            <w:pPr>
+              <w:spacing w:after="0" w:before="0" w:line="235"/>
+              <w:jc w:val="center"/>
+            </w:pPr>
+            <w:r>
+              <w:rPr>
+                <w:rFonts w:ascii="Arial" w:cs="Arial" w:eastAsia="Arial" w:hAnsi="Arial"/>
+                <w:color w:val="28332E"/>
+                <w:sz w:val="16"/>
+                <w:szCs w:val="16"/>
+              </w:rPr>
+              <w:t xml:space="preserve">SM-04</w:t>
+            </w:r>
+          </w:p>
+        </w:tc>
+        <w:tc>
+          <w:tcPr>
+            <w:tcW w:type="dxa" w:w="4048"/>
+            <w:tcBorders>
+              <w:top w:val="single" w:color="CBD5CF" w:sz="2"/>
+              <w:left w:val="single" w:color="CBD5CF" w:sz="2"/>
+              <w:bottom w:val="single" w:color="CBD5CF" w:sz="2"/>
+              <w:right w:val="single" w:color="CBD5CF" w:sz="2"/>
+            </w:tcBorders>
+            <w:shd w:fill="F4F7F5" w:val="clear"/>
+            <w:tcMar>
+              <w:top w:type="dxa" w:w="85"/>
+              <w:left w:type="dxa" w:w="110"/>
+              <w:bottom w:type="dxa" w:w="85"/>
+              <w:right w:type="dxa" w:w="110"/>
+            </w:tcMar>
+            <w:vAlign w:val="center"/>
+          </w:tcPr>
+          <w:p>
+            <w:pPr>
+              <w:spacing w:after="0" w:before="0" w:line="235"/>
+              <w:jc w:val="left"/>
+            </w:pPr>
+            <w:r>
+              <w:rPr>
+                <w:rFonts w:ascii="Arial" w:cs="Arial" w:eastAsia="Arial" w:hAnsi="Arial"/>
+                <w:color w:val="28332E"/>
+                <w:sz w:val="16"/>
+                <w:szCs w:val="16"/>
+              </w:rPr>
+              <w:t xml:space="preserve">Công nợ chi tiết MÃ KHÁCH</w:t>
+            </w:r>
+          </w:p>
+        </w:tc>
+        <w:tc>
+          <w:tcPr>
+            <w:tcW w:type="dxa" w:w="2217"/>
+            <w:tcBorders>
+              <w:top w:val="single" w:color="CBD5CF" w:sz="2"/>
+              <w:left w:val="single" w:color="CBD5CF" w:sz="2"/>
+              <w:bottom w:val="single" w:color="CBD5CF" w:sz="2"/>
+              <w:right w:val="single" w:color="CBD5CF" w:sz="2"/>
+            </w:tcBorders>
+            <w:shd w:fill="F4F7F5" w:val="clear"/>
+            <w:tcMar>
+              <w:top w:type="dxa" w:w="85"/>
+              <w:left w:type="dxa" w:w="110"/>
+              <w:bottom w:type="dxa" w:w="85"/>
+              <w:right w:type="dxa" w:w="110"/>
+            </w:tcMar>
+            <w:vAlign w:val="center"/>
+          </w:tcPr>
+          <w:p>
+            <w:pPr>
+              <w:spacing w:after="0" w:before="0" w:line="235"/>
+              <w:jc w:val="left"/>
+            </w:pPr>
+            <w:r>
+              <w:rPr>
+                <w:rFonts w:ascii="Arial" w:cs="Arial" w:eastAsia="Arial" w:hAnsi="Arial"/>
+                <w:color w:val="28332E"/>
+                <w:sz w:val="16"/>
+                <w:szCs w:val="16"/>
+              </w:rPr>
+              <w:t xml:space="preserve">☑ PASS kỹ thuật (smoke)</w:t>
+            </w:r>
+          </w:p>
+        </w:tc>
+        <w:tc>
+          <w:tcPr>
+            <w:tcW w:type="dxa" w:w="2216"/>
+            <w:tcBorders>
+              <w:top w:val="single" w:color="CBD5CF" w:sz="2"/>
+              <w:left w:val="single" w:color="CBD5CF" w:sz="2"/>
+              <w:bottom w:val="single" w:color="CBD5CF" w:sz="2"/>
+              <w:right w:val="single" w:color="CBD5CF" w:sz="2"/>
+            </w:tcBorders>
+            <w:shd w:fill="F4F7F5" w:val="clear"/>
+            <w:tcMar>
+              <w:top w:type="dxa" w:w="85"/>
+              <w:left w:type="dxa" w:w="110"/>
+              <w:bottom w:type="dxa" w:w="85"/>
+              <w:right w:type="dxa" w:w="110"/>
+            </w:tcMar>
+            <w:vAlign w:val="center"/>
+          </w:tcPr>
+          <w:p>
+            <w:pPr>
+              <w:spacing w:after="0" w:before="0" w:line="235"/>
+              <w:jc w:val="left"/>
+            </w:pPr>
+            <w:r>
+              <w:rPr>
+                <w:rFonts w:ascii="Arial" w:cs="Arial" w:eastAsia="Arial" w:hAnsi="Arial"/>
+                <w:color w:val="28332E"/>
+                <w:sz w:val="16"/>
+                <w:szCs w:val="16"/>
+              </w:rPr>
+              <w:t xml:space="preserve">☑ PASS kỹ thuật (smoke)</w:t>
+            </w:r>
+          </w:p>
+        </w:tc>
+      </w:tr>
+      <w:tr>
+        <w:trPr>
+          <w:cantSplit/>
+        </w:trPr>
+        <w:tc>
+          <w:tcPr>
+            <w:tcW w:type="dxa" w:w="1157"/>
+            <w:tcBorders>
+              <w:top w:val="single" w:color="CBD5CF" w:sz="2"/>
+              <w:left w:val="single" w:color="CBD5CF" w:sz="2"/>
+              <w:bottom w:val="single" w:color="CBD5CF" w:sz="2"/>
+              <w:right w:val="single" w:color="CBD5CF" w:sz="2"/>
+            </w:tcBorders>
+            <w:tcMar>
+              <w:top w:type="dxa" w:w="85"/>
+              <w:left w:type="dxa" w:w="110"/>
+              <w:bottom w:type="dxa" w:w="85"/>
+              <w:right w:type="dxa" w:w="110"/>
+            </w:tcMar>
+            <w:vAlign w:val="center"/>
+          </w:tcPr>
+          <w:p>
+            <w:pPr>
+              <w:spacing w:after="0" w:before="0" w:line="235"/>
+              <w:jc w:val="center"/>
+            </w:pPr>
+            <w:r>
+              <w:rPr>
+                <w:rFonts w:ascii="Arial" w:cs="Arial" w:eastAsia="Arial" w:hAnsi="Arial"/>
+                <w:color w:val="28332E"/>
+                <w:sz w:val="16"/>
+                <w:szCs w:val="16"/>
+              </w:rPr>
+              <w:t xml:space="preserve">SM-05</w:t>
+            </w:r>
+          </w:p>
+        </w:tc>
+        <w:tc>
+          <w:tcPr>
+            <w:tcW w:type="dxa" w:w="4048"/>
+            <w:tcBorders>
+              <w:top w:val="single" w:color="CBD5CF" w:sz="2"/>
+              <w:left w:val="single" w:color="CBD5CF" w:sz="2"/>
+              <w:bottom w:val="single" w:color="CBD5CF" w:sz="2"/>
+              <w:right w:val="single" w:color="CBD5CF" w:sz="2"/>
+            </w:tcBorders>
+            <w:tcMar>
+              <w:top w:type="dxa" w:w="85"/>
+              <w:left w:type="dxa" w:w="110"/>
+              <w:bottom w:type="dxa" w:w="85"/>
+              <w:right w:type="dxa" w:w="110"/>
+            </w:tcMar>
+            <w:vAlign w:val="center"/>
+          </w:tcPr>
+          <w:p>
+            <w:pPr>
+              <w:spacing w:after="0" w:before="0" w:line="235"/>
+              <w:jc w:val="left"/>
+            </w:pPr>
+            <w:r>
+              <w:rPr>
+                <w:rFonts w:ascii="Arial" w:cs="Arial" w:eastAsia="Arial" w:hAnsi="Arial"/>
+                <w:color w:val="28332E"/>
+                <w:sz w:val="16"/>
+                <w:szCs w:val="16"/>
+              </w:rPr>
+              <w:t xml:space="preserve">Gợi ý đơn hàng cho MÃ KHÁCH</w:t>
+            </w:r>
+          </w:p>
+        </w:tc>
+        <w:tc>
+          <w:tcPr>
+            <w:tcW w:type="dxa" w:w="2217"/>
+            <w:tcBorders>
+              <w:top w:val="single" w:color="CBD5CF" w:sz="2"/>
+              <w:left w:val="single" w:color="CBD5CF" w:sz="2"/>
+              <w:bottom w:val="single" w:color="CBD5CF" w:sz="2"/>
+              <w:right w:val="single" w:color="CBD5CF" w:sz="2"/>
+            </w:tcBorders>
+            <w:tcMar>
+              <w:top w:type="dxa" w:w="85"/>
+              <w:left w:type="dxa" w:w="110"/>
+              <w:bottom w:type="dxa" w:w="85"/>
+              <w:right w:type="dxa" w:w="110"/>
+            </w:tcMar>
+            <w:vAlign w:val="center"/>
+          </w:tcPr>
+          <w:p>
+            <w:pPr>
+              <w:spacing w:after="0" w:before="0" w:line="235"/>
+              <w:jc w:val="left"/>
+            </w:pPr>
+            <w:r>
+              <w:rPr>
+                <w:rFonts w:ascii="Arial" w:cs="Arial" w:eastAsia="Arial" w:hAnsi="Arial"/>
+                <w:color w:val="28332E"/>
+                <w:sz w:val="16"/>
+                <w:szCs w:val="16"/>
+              </w:rPr>
+              <w:t xml:space="preserve">☑ PASS kỹ thuật (smoke)</w:t>
+            </w:r>
+          </w:p>
+        </w:tc>
+        <w:tc>
+          <w:tcPr>
+            <w:tcW w:type="dxa" w:w="2216"/>
+            <w:tcBorders>
+              <w:top w:val="single" w:color="CBD5CF" w:sz="2"/>
+              <w:left w:val="single" w:color="CBD5CF" w:sz="2"/>
+              <w:bottom w:val="single" w:color="CBD5CF" w:sz="2"/>
+              <w:right w:val="single" w:color="CBD5CF" w:sz="2"/>
+            </w:tcBorders>
+            <w:tcMar>
+              <w:top w:type="dxa" w:w="85"/>
+              <w:left w:type="dxa" w:w="110"/>
+              <w:bottom w:type="dxa" w:w="85"/>
+              <w:right w:type="dxa" w:w="110"/>
+            </w:tcMar>
+            <w:vAlign w:val="center"/>
+          </w:tcPr>
+          <w:p>
+            <w:pPr>
+              <w:spacing w:after="0" w:before="0" w:line="235"/>
+              <w:jc w:val="left"/>
+            </w:pPr>
+            <w:r>
+              <w:rPr>
+                <w:rFonts w:ascii="Arial" w:cs="Arial" w:eastAsia="Arial" w:hAnsi="Arial"/>
+                <w:color w:val="28332E"/>
+                <w:sz w:val="16"/>
+                <w:szCs w:val="16"/>
+              </w:rPr>
+              <w:t xml:space="preserve">☑ PASS kỹ thuật (smoke)</w:t>
+            </w:r>
+          </w:p>
+        </w:tc>
+      </w:tr>
+      <w:tr>
+        <w:trPr>
+          <w:cantSplit/>
+        </w:trPr>
+        <w:tc>
+          <w:tcPr>
+            <w:tcW w:type="dxa" w:w="1157"/>
+            <w:tcBorders>
+              <w:top w:val="single" w:color="CBD5CF" w:sz="2"/>
+              <w:left w:val="single" w:color="CBD5CF" w:sz="2"/>
+              <w:bottom w:val="single" w:color="CBD5CF" w:sz="2"/>
+              <w:right w:val="single" w:color="CBD5CF" w:sz="2"/>
+            </w:tcBorders>
+            <w:shd w:fill="F4F7F5" w:val="clear"/>
+            <w:tcMar>
+              <w:top w:type="dxa" w:w="85"/>
+              <w:left w:type="dxa" w:w="110"/>
+              <w:bottom w:type="dxa" w:w="85"/>
+              <w:right w:type="dxa" w:w="110"/>
+            </w:tcMar>
+            <w:vAlign w:val="center"/>
+          </w:tcPr>
+          <w:p>
+            <w:pPr>
+              <w:spacing w:after="0" w:before="0" w:line="235"/>
+              <w:jc w:val="center"/>
+            </w:pPr>
+            <w:r>
+              <w:rPr>
+                <w:rFonts w:ascii="Arial" w:cs="Arial" w:eastAsia="Arial" w:hAnsi="Arial"/>
+                <w:color w:val="28332E"/>
+                <w:sz w:val="16"/>
+                <w:szCs w:val="16"/>
+              </w:rPr>
+              <w:t xml:space="preserve">SM-06</w:t>
+            </w:r>
+          </w:p>
+        </w:tc>
+        <w:tc>
+          <w:tcPr>
+            <w:tcW w:type="dxa" w:w="4048"/>
+            <w:tcBorders>
+              <w:top w:val="single" w:color="CBD5CF" w:sz="2"/>
+              <w:left w:val="single" w:color="CBD5CF" w:sz="2"/>
+              <w:bottom w:val="single" w:color="CBD5CF" w:sz="2"/>
+              <w:right w:val="single" w:color="CBD5CF" w:sz="2"/>
+            </w:tcBorders>
+            <w:shd w:fill="F4F7F5" w:val="clear"/>
+            <w:tcMar>
+              <w:top w:type="dxa" w:w="85"/>
+              <w:left w:type="dxa" w:w="110"/>
+              <w:bottom w:type="dxa" w:w="85"/>
+              <w:right w:type="dxa" w:w="110"/>
+            </w:tcMar>
+            <w:vAlign w:val="center"/>
+          </w:tcPr>
+          <w:p>
+            <w:pPr>
+              <w:spacing w:after="0" w:before="0" w:line="235"/>
+              <w:jc w:val="left"/>
+            </w:pPr>
+            <w:r>
+              <w:rPr>
+                <w:rFonts w:ascii="Arial" w:cs="Arial" w:eastAsia="Arial" w:hAnsi="Arial"/>
+                <w:color w:val="28332E"/>
+                <w:sz w:val="16"/>
+                <w:szCs w:val="16"/>
+              </w:rPr>
+              <w:t xml:space="preserve">Tồn kho MÃ SẢN PHẨM</w:t>
+            </w:r>
+          </w:p>
+        </w:tc>
+        <w:tc>
+          <w:tcPr>
+            <w:tcW w:type="dxa" w:w="2217"/>
+            <w:tcBorders>
+              <w:top w:val="single" w:color="CBD5CF" w:sz="2"/>
+              <w:left w:val="single" w:color="CBD5CF" w:sz="2"/>
+              <w:bottom w:val="single" w:color="CBD5CF" w:sz="2"/>
+              <w:right w:val="single" w:color="CBD5CF" w:sz="2"/>
+            </w:tcBorders>
+            <w:shd w:fill="F4F7F5" w:val="clear"/>
+            <w:tcMar>
+              <w:top w:type="dxa" w:w="85"/>
+              <w:left w:type="dxa" w:w="110"/>
+              <w:bottom w:type="dxa" w:w="85"/>
+              <w:right w:type="dxa" w:w="110"/>
+            </w:tcMar>
+            <w:vAlign w:val="center"/>
+          </w:tcPr>
+          <w:p>
+            <w:pPr>
+              <w:spacing w:after="0" w:before="0" w:line="235"/>
+              <w:jc w:val="left"/>
+            </w:pPr>
+            <w:r>
+              <w:rPr>
+                <w:rFonts w:ascii="Arial" w:cs="Arial" w:eastAsia="Arial" w:hAnsi="Arial"/>
+                <w:color w:val="28332E"/>
+                <w:sz w:val="16"/>
+                <w:szCs w:val="16"/>
+              </w:rPr>
+              <w:t xml:space="preserve">☑ PASS kỹ thuật (smoke)</w:t>
+            </w:r>
+          </w:p>
+        </w:tc>
+        <w:tc>
+          <w:tcPr>
+            <w:tcW w:type="dxa" w:w="2216"/>
+            <w:tcBorders>
+              <w:top w:val="single" w:color="CBD5CF" w:sz="2"/>
+              <w:left w:val="single" w:color="CBD5CF" w:sz="2"/>
+              <w:bottom w:val="single" w:color="CBD5CF" w:sz="2"/>
+              <w:right w:val="single" w:color="CBD5CF" w:sz="2"/>
+            </w:tcBorders>
+            <w:shd w:fill="F4F7F5" w:val="clear"/>
+            <w:tcMar>
+              <w:top w:type="dxa" w:w="85"/>
+              <w:left w:type="dxa" w:w="110"/>
+              <w:bottom w:type="dxa" w:w="85"/>
+              <w:right w:type="dxa" w:w="110"/>
+            </w:tcMar>
+            <w:vAlign w:val="center"/>
+          </w:tcPr>
+          <w:p>
+            <w:pPr>
+              <w:spacing w:after="0" w:before="0" w:line="235"/>
+              <w:jc w:val="left"/>
+            </w:pPr>
+            <w:r>
+              <w:rPr>
+                <w:rFonts w:ascii="Arial" w:cs="Arial" w:eastAsia="Arial" w:hAnsi="Arial"/>
+                <w:color w:val="28332E"/>
+                <w:sz w:val="16"/>
+                <w:szCs w:val="16"/>
+              </w:rPr>
+              <w:t xml:space="preserve">☑ PASS kỹ thuật (smoke)</w:t>
+            </w:r>
+          </w:p>
+        </w:tc>
+      </w:tr>
+      <w:tr>
+        <w:trPr>
+          <w:cantSplit/>
+        </w:trPr>
+        <w:tc>
+          <w:tcPr>
+            <w:tcW w:type="dxa" w:w="1157"/>
+            <w:tcBorders>
+              <w:top w:val="single" w:color="CBD5CF" w:sz="2"/>
+              <w:left w:val="single" w:color="CBD5CF" w:sz="2"/>
+              <w:bottom w:val="single" w:color="CBD5CF" w:sz="2"/>
+              <w:right w:val="single" w:color="CBD5CF" w:sz="2"/>
+            </w:tcBorders>
+            <w:tcMar>
+              <w:top w:type="dxa" w:w="85"/>
+              <w:left w:type="dxa" w:w="110"/>
+              <w:bottom w:type="dxa" w:w="85"/>
+              <w:right w:type="dxa" w:w="110"/>
+            </w:tcMar>
+            <w:vAlign w:val="center"/>
+          </w:tcPr>
+          <w:p>
+            <w:pPr>
+              <w:spacing w:after="0" w:before="0" w:line="235"/>
+              <w:jc w:val="center"/>
+            </w:pPr>
+            <w:r>
+              <w:rPr>
+                <w:rFonts w:ascii="Arial" w:cs="Arial" w:eastAsia="Arial" w:hAnsi="Arial"/>
+                <w:color w:val="28332E"/>
+                <w:sz w:val="16"/>
+                <w:szCs w:val="16"/>
+              </w:rPr>
+              <w:t xml:space="preserve">SM-07</w:t>
+            </w:r>
+          </w:p>
+        </w:tc>
+        <w:tc>
+          <w:tcPr>
+            <w:tcW w:type="dxa" w:w="4048"/>
+            <w:tcBorders>
+              <w:top w:val="single" w:color="CBD5CF" w:sz="2"/>
+              <w:left w:val="single" w:color="CBD5CF" w:sz="2"/>
+              <w:bottom w:val="single" w:color="CBD5CF" w:sz="2"/>
+              <w:right w:val="single" w:color="CBD5CF" w:sz="2"/>
+            </w:tcBorders>
+            <w:tcMar>
+              <w:top w:type="dxa" w:w="85"/>
+              <w:left w:type="dxa" w:w="110"/>
+              <w:bottom w:type="dxa" w:w="85"/>
+              <w:right w:type="dxa" w:w="110"/>
+            </w:tcMar>
+            <w:vAlign w:val="center"/>
+          </w:tcPr>
+          <w:p>
+            <w:pPr>
+              <w:spacing w:after="0" w:before="0" w:line="235"/>
+              <w:jc w:val="left"/>
+            </w:pPr>
+            <w:r>
+              <w:rPr>
+                <w:rFonts w:ascii="Arial" w:cs="Arial" w:eastAsia="Arial" w:hAnsi="Arial"/>
+                <w:color w:val="28332E"/>
+                <w:sz w:val="16"/>
+                <w:szCs w:val="16"/>
+              </w:rPr>
+              <w:t xml:space="preserve">Thiếu mã khách — hệ thống hỏi bổ sung</w:t>
+            </w:r>
+          </w:p>
+        </w:tc>
+        <w:tc>
+          <w:tcPr>
+            <w:tcW w:type="dxa" w:w="2217"/>
+            <w:tcBorders>
+              <w:top w:val="single" w:color="CBD5CF" w:sz="2"/>
+              <w:left w:val="single" w:color="CBD5CF" w:sz="2"/>
+              <w:bottom w:val="single" w:color="CBD5CF" w:sz="2"/>
+              <w:right w:val="single" w:color="CBD5CF" w:sz="2"/>
+            </w:tcBorders>
+            <w:tcMar>
+              <w:top w:type="dxa" w:w="85"/>
+              <w:left w:type="dxa" w:w="110"/>
+              <w:bottom w:type="dxa" w:w="85"/>
+              <w:right w:type="dxa" w:w="110"/>
+            </w:tcMar>
+            <w:vAlign w:val="center"/>
+          </w:tcPr>
+          <w:p>
+            <w:pPr>
+              <w:spacing w:after="0" w:before="0" w:line="235"/>
+              <w:jc w:val="left"/>
+            </w:pPr>
+            <w:r>
+              <w:rPr>
+                <w:rFonts w:ascii="Arial" w:cs="Arial" w:eastAsia="Arial" w:hAnsi="Arial"/>
+                <w:color w:val="28332E"/>
+                <w:sz w:val="16"/>
+                <w:szCs w:val="16"/>
+              </w:rPr>
+              <w:t xml:space="preserve">☑ PASS kỹ thuật (smoke)</w:t>
+            </w:r>
+          </w:p>
+        </w:tc>
+        <w:tc>
+          <w:tcPr>
+            <w:tcW w:type="dxa" w:w="2216"/>
+            <w:tcBorders>
+              <w:top w:val="single" w:color="CBD5CF" w:sz="2"/>
+              <w:left w:val="single" w:color="CBD5CF" w:sz="2"/>
+              <w:bottom w:val="single" w:color="CBD5CF" w:sz="2"/>
+              <w:right w:val="single" w:color="CBD5CF" w:sz="2"/>
+            </w:tcBorders>
+            <w:tcMar>
+              <w:top w:type="dxa" w:w="85"/>
+              <w:left w:type="dxa" w:w="110"/>
+              <w:bottom w:type="dxa" w:w="85"/>
+              <w:right w:type="dxa" w:w="110"/>
+            </w:tcMar>
+            <w:vAlign w:val="center"/>
+          </w:tcPr>
+          <w:p>
+            <w:pPr>
+              <w:spacing w:after="0" w:before="0" w:line="235"/>
+              <w:jc w:val="left"/>
+            </w:pPr>
+            <w:r>
+              <w:rPr>
+                <w:rFonts w:ascii="Arial" w:cs="Arial" w:eastAsia="Arial" w:hAnsi="Arial"/>
+                <w:color w:val="28332E"/>
+                <w:sz w:val="16"/>
+                <w:szCs w:val="16"/>
+              </w:rPr>
+              <w:t xml:space="preserve">☑ PASS kỹ thuật (smoke)</w:t>
+            </w:r>
+          </w:p>
+        </w:tc>
+      </w:tr>
+      <w:tr>
+        <w:trPr>
+          <w:cantSplit/>
+        </w:trPr>
+        <w:tc>
+          <w:tcPr>
+            <w:tcW w:type="dxa" w:w="1157"/>
+            <w:tcBorders>
+              <w:top w:val="single" w:color="CBD5CF" w:sz="2"/>
+              <w:left w:val="single" w:color="CBD5CF" w:sz="2"/>
+              <w:bottom w:val="single" w:color="CBD5CF" w:sz="2"/>
+              <w:right w:val="single" w:color="CBD5CF" w:sz="2"/>
+            </w:tcBorders>
+            <w:shd w:fill="F4F7F5" w:val="clear"/>
+            <w:tcMar>
+              <w:top w:type="dxa" w:w="85"/>
+              <w:left w:type="dxa" w:w="110"/>
+              <w:bottom w:type="dxa" w:w="85"/>
+              <w:right w:type="dxa" w:w="110"/>
+            </w:tcMar>
+            <w:vAlign w:val="center"/>
+          </w:tcPr>
+          <w:p>
+            <w:pPr>
+              <w:spacing w:after="0" w:before="0" w:line="235"/>
+              <w:jc w:val="center"/>
+            </w:pPr>
+            <w:r>
+              <w:rPr>
+                <w:rFonts w:ascii="Arial" w:cs="Arial" w:eastAsia="Arial" w:hAnsi="Arial"/>
+                <w:color w:val="28332E"/>
+                <w:sz w:val="16"/>
+                <w:szCs w:val="16"/>
+              </w:rPr>
+              <w:t xml:space="preserve">SM-08</w:t>
+            </w:r>
+          </w:p>
+        </w:tc>
+        <w:tc>
+          <w:tcPr>
+            <w:tcW w:type="dxa" w:w="4048"/>
+            <w:tcBorders>
+              <w:top w:val="single" w:color="CBD5CF" w:sz="2"/>
+              <w:left w:val="single" w:color="CBD5CF" w:sz="2"/>
+              <w:bottom w:val="single" w:color="CBD5CF" w:sz="2"/>
+              <w:right w:val="single" w:color="CBD5CF" w:sz="2"/>
+            </w:tcBorders>
+            <w:shd w:fill="F4F7F5" w:val="clear"/>
+            <w:tcMar>
+              <w:top w:type="dxa" w:w="85"/>
+              <w:left w:type="dxa" w:w="110"/>
+              <w:bottom w:type="dxa" w:w="85"/>
+              <w:right w:type="dxa" w:w="110"/>
+            </w:tcMar>
+            <w:vAlign w:val="center"/>
+          </w:tcPr>
+          <w:p>
+            <w:pPr>
+              <w:spacing w:after="0" w:before="0" w:line="235"/>
+              <w:jc w:val="left"/>
+            </w:pPr>
+            <w:r>
+              <w:rPr>
+                <w:rFonts w:ascii="Arial" w:cs="Arial" w:eastAsia="Arial" w:hAnsi="Arial"/>
+                <w:color w:val="28332E"/>
+                <w:sz w:val="16"/>
+                <w:szCs w:val="16"/>
+              </w:rPr>
+              <w:t xml:space="preserve">Câu hỏi ngoài phạm vi — không gọi API</w:t>
+            </w:r>
+          </w:p>
+        </w:tc>
+        <w:tc>
+          <w:tcPr>
+            <w:tcW w:type="dxa" w:w="2217"/>
+            <w:tcBorders>
+              <w:top w:val="single" w:color="CBD5CF" w:sz="2"/>
+              <w:left w:val="single" w:color="CBD5CF" w:sz="2"/>
+              <w:bottom w:val="single" w:color="CBD5CF" w:sz="2"/>
+              <w:right w:val="single" w:color="CBD5CF" w:sz="2"/>
+            </w:tcBorders>
+            <w:shd w:fill="F4F7F5" w:val="clear"/>
+            <w:tcMar>
+              <w:top w:type="dxa" w:w="85"/>
+              <w:left w:type="dxa" w:w="110"/>
+              <w:bottom w:type="dxa" w:w="85"/>
+              <w:right w:type="dxa" w:w="110"/>
+            </w:tcMar>
+            <w:vAlign w:val="center"/>
+          </w:tcPr>
+          <w:p>
+            <w:pPr>
+              <w:spacing w:after="0" w:before="0" w:line="235"/>
+              <w:jc w:val="left"/>
+            </w:pPr>
+            <w:r>
+              <w:rPr>
+                <w:rFonts w:ascii="Arial" w:cs="Arial" w:eastAsia="Arial" w:hAnsi="Arial"/>
+                <w:color w:val="28332E"/>
+                <w:sz w:val="16"/>
+                <w:szCs w:val="16"/>
+              </w:rPr>
+              <w:t xml:space="preserve">☑ PASS kỹ thuật (smoke)</w:t>
+            </w:r>
+          </w:p>
+        </w:tc>
+        <w:tc>
+          <w:tcPr>
+            <w:tcW w:type="dxa" w:w="2216"/>
+            <w:tcBorders>
+              <w:top w:val="single" w:color="CBD5CF" w:sz="2"/>
+              <w:left w:val="single" w:color="CBD5CF" w:sz="2"/>
+              <w:bottom w:val="single" w:color="CBD5CF" w:sz="2"/>
+              <w:right w:val="single" w:color="CBD5CF" w:sz="2"/>
+            </w:tcBorders>
+            <w:shd w:fill="F4F7F5" w:val="clear"/>
+            <w:tcMar>
+              <w:top w:type="dxa" w:w="85"/>
+              <w:left w:type="dxa" w:w="110"/>
+              <w:bottom w:type="dxa" w:w="85"/>
+              <w:right w:type="dxa" w:w="110"/>
+            </w:tcMar>
+            <w:vAlign w:val="center"/>
+          </w:tcPr>
+          <w:p>
+            <w:pPr>
+              <w:spacing w:after="0" w:before="0" w:line="235"/>
+              <w:jc w:val="left"/>
+            </w:pPr>
+            <w:r>
+              <w:rPr>
+                <w:rFonts w:ascii="Arial" w:cs="Arial" w:eastAsia="Arial" w:hAnsi="Arial"/>
+                <w:color w:val="28332E"/>
+                <w:sz w:val="16"/>
+                <w:szCs w:val="16"/>
+              </w:rPr>
+              <w:t xml:space="preserve">☑ PASS kỹ thuật (smoke)</w:t>
+            </w:r>
           </w:p>
         </w:tc>
       </w:tr>
@@ -6353,6 +7693,15 @@
               <w:spacing w:after="0" w:before="0" w:line="225"/>
               <w:jc w:val="left"/>
             </w:pPr>
+            <w:r>
+              <w:rPr>
+                <w:rFonts w:ascii="Arial" w:cs="Arial" w:eastAsia="Arial" w:hAnsi="Arial"/>
+                <w:color w:val="28332E"/>
+                <w:sz w:val="14"/>
+                <w:szCs w:val="14"/>
+              </w:rPr>
+              <w:t xml:space="preserve">☑ PASS kỹ thuật (smoke)</w:t>
+            </w:r>
           </w:p>
         </w:tc>
       </w:tr>
@@ -7541,6 +8890,15 @@
               <w:spacing w:after="0" w:before="0" w:line="225"/>
               <w:jc w:val="left"/>
             </w:pPr>
+            <w:r>
+              <w:rPr>
+                <w:rFonts w:ascii="Arial" w:cs="Arial" w:eastAsia="Arial" w:hAnsi="Arial"/>
+                <w:color w:val="28332E"/>
+                <w:sz w:val="14"/>
+                <w:szCs w:val="14"/>
+              </w:rPr>
+              <w:t xml:space="preserve">☑ PASS kỹ thuật (smoke)</w:t>
+            </w:r>
           </w:p>
         </w:tc>
       </w:tr>
@@ -8138,6 +9496,15 @@
               <w:spacing w:after="0" w:before="0" w:line="225"/>
               <w:jc w:val="left"/>
             </w:pPr>
+            <w:r>
+              <w:rPr>
+                <w:rFonts w:ascii="Arial" w:cs="Arial" w:eastAsia="Arial" w:hAnsi="Arial"/>
+                <w:color w:val="28332E"/>
+                <w:sz w:val="14"/>
+                <w:szCs w:val="14"/>
+              </w:rPr>
+              <w:t xml:space="preserve">☑ PASS kỹ thuật (smoke)</w:t>
+            </w:r>
           </w:p>
         </w:tc>
       </w:tr>
@@ -8729,6 +10096,15 @@
               <w:spacing w:after="0" w:before="0" w:line="225"/>
               <w:jc w:val="left"/>
             </w:pPr>
+            <w:r>
+              <w:rPr>
+                <w:rFonts w:ascii="Arial" w:cs="Arial" w:eastAsia="Arial" w:hAnsi="Arial"/>
+                <w:color w:val="28332E"/>
+                <w:sz w:val="14"/>
+                <w:szCs w:val="14"/>
+              </w:rPr>
+              <w:t xml:space="preserve">☑ PASS kỹ thuật (smoke)</w:t>
+            </w:r>
           </w:p>
         </w:tc>
       </w:tr>
@@ -12288,6 +13664,15 @@
               <w:spacing w:after="0" w:before="0" w:line="230"/>
               <w:jc w:val="left"/>
             </w:pPr>
+            <w:r>
+              <w:rPr>
+                <w:rFonts w:ascii="Arial" w:cs="Arial" w:eastAsia="Arial" w:hAnsi="Arial"/>
+                <w:color w:val="28332E"/>
+                <w:sz w:val="15"/>
+                <w:szCs w:val="15"/>
+              </w:rPr>
+              <w:t xml:space="preserve">☑ PASS kỹ thuật (smoke)</w:t>
+            </w:r>
           </w:p>
         </w:tc>
       </w:tr>
@@ -30571,7 +31956,7 @@
                 <w:sz w:val="18"/>
                 <w:szCs w:val="18"/>
               </w:rPr>
-              <w:t xml:space="preserve">Số tài khoản đã chạy</w:t>
+              <w:t xml:space="preserve">Smoke kỹ thuật đã chạy</w:t>
             </w:r>
           </w:p>
         </w:tc>
@@ -30604,7 +31989,7 @@
                 <w:sz w:val="18"/>
                 <w:szCs w:val="18"/>
               </w:rPr>
-              <w:t xml:space="preserve">........ / 13</w:t>
+              <w:t xml:space="preserve">Sale 8/8 · Quản lý 8/8</w:t>
             </w:r>
           </w:p>
         </w:tc>
@@ -30643,7 +32028,7 @@
                 <w:sz w:val="18"/>
                 <w:szCs w:val="18"/>
               </w:rPr>
-              <w:t xml:space="preserve">Số chức năng đã chạy</w:t>
+              <w:t xml:space="preserve">Số tài khoản khách hàng đã nghiệm thu</w:t>
             </w:r>
           </w:p>
         </w:tc>
@@ -30677,7 +32062,7 @@
                 <w:sz w:val="18"/>
                 <w:szCs w:val="18"/>
               </w:rPr>
-              <w:t xml:space="preserve">........ / 24</w:t>
+              <w:t xml:space="preserve">........ / 13</w:t>
             </w:r>
           </w:p>
         </w:tc>
@@ -30715,7 +32100,7 @@
                 <w:sz w:val="18"/>
                 <w:szCs w:val="18"/>
               </w:rPr>
-              <w:t xml:space="preserve">Lỗi nghiêm trọng còn mở</w:t>
+              <w:t xml:space="preserve">Số chức năng khách hàng đã nghiệm thu</w:t>
             </w:r>
           </w:p>
         </w:tc>
@@ -30741,6 +32126,15 @@
               <w:spacing w:after="0" w:before="0" w:line="245"/>
               <w:jc w:val="left"/>
             </w:pPr>
+            <w:r>
+              <w:rPr>
+                <w:rFonts w:ascii="Arial" w:cs="Arial" w:eastAsia="Arial" w:hAnsi="Arial"/>
+                <w:color w:val="28332E"/>
+                <w:sz w:val="18"/>
+                <w:szCs w:val="18"/>
+              </w:rPr>
+              <w:t xml:space="preserve">........ / 24</w:t>
+            </w:r>
           </w:p>
         </w:tc>
       </w:tr>
@@ -30778,7 +32172,7 @@
                 <w:sz w:val="18"/>
                 <w:szCs w:val="18"/>
               </w:rPr>
-              <w:t xml:space="preserve">Danh sách mã UAT_TEST cần dọn</w:t>
+              <w:t xml:space="preserve">Lỗi nghiêm trọng còn mở</w:t>
             </w:r>
           </w:p>
         </w:tc>
@@ -30841,7 +32235,7 @@
                 <w:sz w:val="18"/>
                 <w:szCs w:val="18"/>
               </w:rPr>
-              <w:t xml:space="preserve">Kết luận</w:t>
+              <w:t xml:space="preserve">Danh sách mã UAT_TEST cần dọn</w:t>
             </w:r>
           </w:p>
         </w:tc>
@@ -30867,15 +32261,6 @@
               <w:spacing w:after="0" w:before="0" w:line="245"/>
               <w:jc w:val="left"/>
             </w:pPr>
-            <w:r>
-              <w:rPr>
-                <w:rFonts w:ascii="Arial" w:cs="Arial" w:eastAsia="Arial" w:hAnsi="Arial"/>
-                <w:color w:val="28332E"/>
-                <w:sz w:val="18"/>
-                <w:szCs w:val="18"/>
-              </w:rPr>
-              <w:t xml:space="preserve">Đủ điều kiện UAT / Cần sửa và kiểm tra lại / Chưa thể đánh giá</w:t>
-            </w:r>
           </w:p>
         </w:tc>
       </w:tr>
@@ -30913,7 +32298,7 @@
                 <w:sz w:val="18"/>
                 <w:szCs w:val="18"/>
               </w:rPr>
-              <w:t xml:space="preserve">Người thực hiện · Ngày</w:t>
+              <w:t xml:space="preserve">Kết luận hiện tại</w:t>
             </w:r>
           </w:p>
         </w:tc>
@@ -30940,6 +32325,15 @@
               <w:spacing w:after="0" w:before="0" w:line="245"/>
               <w:jc w:val="left"/>
             </w:pPr>
+            <w:r>
+              <w:rPr>
+                <w:rFonts w:ascii="Arial" w:cs="Arial" w:eastAsia="Arial" w:hAnsi="Arial"/>
+                <w:color w:val="28332E"/>
+                <w:sz w:val="18"/>
+                <w:szCs w:val="18"/>
+              </w:rPr>
+              <w:t xml:space="preserve">Đủ điều kiện bắt đầu UAT khách hàng · Chưa phải nghiệm thu hoàn tất</w:t>
+            </w:r>
           </w:p>
         </w:tc>
       </w:tr>
@@ -30976,7 +32370,7 @@
                 <w:sz w:val="18"/>
                 <w:szCs w:val="18"/>
               </w:rPr>
-              <w:t xml:space="preserve">Điều phối viên · Ngày</w:t>
+              <w:t xml:space="preserve">Người thực hiện · Ngày</w:t>
             </w:r>
           </w:p>
         </w:tc>
@@ -31039,6 +32433,69 @@
                 <w:sz w:val="18"/>
                 <w:szCs w:val="18"/>
               </w:rPr>
+              <w:t xml:space="preserve">Điều phối viên · Ngày</w:t>
+            </w:r>
+          </w:p>
+        </w:tc>
+        <w:tc>
+          <w:tcPr>
+            <w:tcW w:type="dxa" w:w="5976"/>
+            <w:tcBorders>
+              <w:top w:val="single" w:color="CBD5CF" w:sz="2"/>
+              <w:left w:val="single" w:color="CBD5CF" w:sz="2"/>
+              <w:bottom w:val="single" w:color="CBD5CF" w:sz="2"/>
+              <w:right w:val="single" w:color="CBD5CF" w:sz="2"/>
+            </w:tcBorders>
+            <w:shd w:fill="F4F7F5" w:val="clear"/>
+            <w:tcMar>
+              <w:top w:type="dxa" w:w="85"/>
+              <w:left w:type="dxa" w:w="110"/>
+              <w:bottom w:type="dxa" w:w="85"/>
+              <w:right w:type="dxa" w:w="110"/>
+            </w:tcMar>
+            <w:vAlign w:val="center"/>
+          </w:tcPr>
+          <w:p>
+            <w:pPr>
+              <w:spacing w:after="0" w:before="0" w:line="245"/>
+              <w:jc w:val="left"/>
+            </w:pPr>
+          </w:p>
+        </w:tc>
+      </w:tr>
+      <w:tr>
+        <w:trPr>
+          <w:cantSplit/>
+        </w:trPr>
+        <w:tc>
+          <w:tcPr>
+            <w:tcW w:type="dxa" w:w="3662"/>
+            <w:tcBorders>
+              <w:top w:val="single" w:color="CBD5CF" w:sz="2"/>
+              <w:left w:val="single" w:color="CBD5CF" w:sz="2"/>
+              <w:bottom w:val="single" w:color="CBD5CF" w:sz="2"/>
+              <w:right w:val="single" w:color="CBD5CF" w:sz="2"/>
+            </w:tcBorders>
+            <w:tcMar>
+              <w:top w:type="dxa" w:w="85"/>
+              <w:left w:type="dxa" w:w="110"/>
+              <w:bottom w:type="dxa" w:w="85"/>
+              <w:right w:type="dxa" w:w="110"/>
+            </w:tcMar>
+            <w:vAlign w:val="center"/>
+          </w:tcPr>
+          <w:p>
+            <w:pPr>
+              <w:spacing w:after="0" w:before="0" w:line="245"/>
+              <w:jc w:val="left"/>
+            </w:pPr>
+            <w:r>
+              <w:rPr>
+                <w:rFonts w:ascii="Arial" w:cs="Arial" w:eastAsia="Arial" w:hAnsi="Arial"/>
+                <w:color w:val="28332E"/>
+                <w:sz w:val="18"/>
+                <w:szCs w:val="18"/>
+              </w:rPr>
               <w:t xml:space="preserve">Đại diện khách hàng · Ngày</w:t>
             </w:r>
           </w:p>
@@ -31052,7 +32509,6 @@
               <w:bottom w:val="single" w:color="CBD5CF" w:sz="2"/>
               <w:right w:val="single" w:color="CBD5CF" w:sz="2"/>
             </w:tcBorders>
-            <w:shd w:fill="F4F7F5" w:val="clear"/>
             <w:tcMar>
               <w:top w:type="dxa" w:w="85"/>
               <w:left w:type="dxa" w:w="110"/>

</xml_diff>